<commit_message>
Second copies of Cyber Projects
</commit_message>
<xml_diff>
--- a/Penetration devices/Evil Twin  Attack.docx
+++ b/Penetration devices/Evil Twin  Attack.docx
@@ -131,15 +131,7 @@
         <w:t>Access Point (AP) Mode</w:t>
       </w:r>
       <w:r>
-        <w:t xml:space="preserve">: Use the </w:t>
-      </w:r>
-      <w:proofErr w:type="spellStart"/>
-      <w:r>
-        <w:t>WiFi.softAP</w:t>
-      </w:r>
-      <w:proofErr w:type="spellEnd"/>
-      <w:r>
-        <w:t>() function to create an open network with the same name (SSID) as your targe</w:t>
+        <w:t>: Use the WiFi.softAP() function to create an open network with the same name (SSID) as your targe</w:t>
       </w:r>
       <w:r>
         <w:t>t</w:t>
@@ -161,15 +153,7 @@
         <w:t>DNS Hijacking</w:t>
       </w:r>
       <w:r>
-        <w:t xml:space="preserve">: You need a DNS server (using the </w:t>
-      </w:r>
-      <w:proofErr w:type="spellStart"/>
-      <w:r>
-        <w:t>DNSServer</w:t>
-      </w:r>
-      <w:proofErr w:type="spellEnd"/>
-      <w:r>
-        <w:t xml:space="preserve"> library) that redirects every request made by a connected device to the ESP32’s own IP address (usually 192.168.4.1).</w:t>
+        <w:t>: You need a DNS server (using the DNSServer library) that redirects every request made by a connected device to the ESP32’s own IP address (usually 192.168.4.1).</w:t>
       </w:r>
     </w:p>
     <w:p>
@@ -188,23 +172,7 @@
         <w:t>Captive Portal</w:t>
       </w:r>
       <w:r>
-        <w:t xml:space="preserve">: Use the </w:t>
-      </w:r>
-      <w:proofErr w:type="spellStart"/>
-      <w:r>
-        <w:t>WebServer</w:t>
-      </w:r>
-      <w:proofErr w:type="spellEnd"/>
-      <w:r>
-        <w:t xml:space="preserve"> or </w:t>
-      </w:r>
-      <w:proofErr w:type="spellStart"/>
-      <w:r>
-        <w:t>ESPAsyncWebServer</w:t>
-      </w:r>
-      <w:proofErr w:type="spellEnd"/>
-      <w:r>
-        <w:t xml:space="preserve"> libraries to serve a phishing page (HTML/CSS). When a user enters their credentials, your code captures that data and saves it to the ESP32's </w:t>
+        <w:t xml:space="preserve">: Use the WebServer or ESPAsyncWebServer libraries to serve a phishing page (HTML/CSS). When a user enters their credentials, your code captures that data and saves it to the ESP32's </w:t>
       </w:r>
       <w:r>
         <w:rPr>
@@ -333,17 +301,2057 @@
         <w:t>ESP-IDF</w:t>
       </w:r>
       <w:r>
-        <w:t xml:space="preserve">: The official development framework from </w:t>
-      </w:r>
-      <w:proofErr w:type="spellStart"/>
-      <w:r>
-        <w:t>Espressif</w:t>
-      </w:r>
-      <w:proofErr w:type="spellEnd"/>
-      <w:r>
-        <w:t xml:space="preserve"> if you want deep, low-level control over the Wi-Fi stack</w:t>
-      </w:r>
-    </w:p>
+        <w:t>: The official development framework from Espressif if you want deep, low-level control over the Wi-Fi stack</w:t>
+      </w:r>
+    </w:p>
+    <w:p/>
+    <w:p>
+      <w:pPr>
+        <w:rPr>
+          <w:b/>
+          <w:bCs/>
+          <w:sz w:val="36"/>
+          <w:szCs w:val="36"/>
+          <w:u w:val="single"/>
+        </w:rPr>
+      </w:pPr>
+      <w:r>
+        <w:rPr>
+          <w:b/>
+          <w:bCs/>
+          <w:sz w:val="36"/>
+          <w:szCs w:val="36"/>
+          <w:highlight w:val="yellow"/>
+          <w:u w:val="single"/>
+        </w:rPr>
+        <w:t>Conducting the Evil Portal Attack:</w:t>
+      </w:r>
+    </w:p>
+    <w:p>
+      <w:pPr>
+        <w:pStyle w:val="ListParagraph"/>
+        <w:numPr>
+          <w:ilvl w:val="0"/>
+          <w:numId w:val="2"/>
+        </w:numPr>
+        <w:rPr>
+          <w:b/>
+          <w:bCs/>
+          <w:sz w:val="36"/>
+          <w:szCs w:val="36"/>
+          <w:highlight w:val="yellow"/>
+          <w:u w:val="single"/>
+        </w:rPr>
+      </w:pPr>
+      <w:r>
+        <w:rPr>
+          <w:b/>
+          <w:bCs/>
+          <w:sz w:val="36"/>
+          <w:szCs w:val="36"/>
+          <w:highlight w:val="yellow"/>
+          <w:u w:val="single"/>
+        </w:rPr>
+        <w:t xml:space="preserve">Make sure your ESP32 S2 Marauder has the proper firmware: </w:t>
+      </w:r>
+    </w:p>
+    <w:p>
+      <w:pPr>
+        <w:pStyle w:val="ListParagraph"/>
+        <w:numPr>
+          <w:ilvl w:val="1"/>
+          <w:numId w:val="2"/>
+        </w:numPr>
+        <w:rPr>
+          <w:b/>
+          <w:bCs/>
+          <w:sz w:val="32"/>
+          <w:szCs w:val="32"/>
+          <w:highlight w:val="cyan"/>
+        </w:rPr>
+      </w:pPr>
+      <w:r>
+        <w:rPr>
+          <w:b/>
+          <w:bCs/>
+          <w:sz w:val="32"/>
+          <w:szCs w:val="32"/>
+          <w:highlight w:val="cyan"/>
+        </w:rPr>
+        <w:t xml:space="preserve">Marauder firmware installed on the ESP32. </w:t>
+      </w:r>
+    </w:p>
+    <w:p>
+      <w:pPr>
+        <w:pStyle w:val="ListParagraph"/>
+        <w:numPr>
+          <w:ilvl w:val="1"/>
+          <w:numId w:val="2"/>
+        </w:numPr>
+        <w:rPr>
+          <w:b/>
+          <w:bCs/>
+          <w:sz w:val="36"/>
+          <w:szCs w:val="36"/>
+          <w:highlight w:val="cyan"/>
+        </w:rPr>
+      </w:pPr>
+      <w:r>
+        <w:rPr>
+          <w:b/>
+          <w:bCs/>
+          <w:sz w:val="36"/>
+          <w:szCs w:val="36"/>
+          <w:highlight w:val="cyan"/>
+        </w:rPr>
+        <w:t xml:space="preserve">Flipper app: </w:t>
+      </w:r>
+    </w:p>
+    <w:p>
+      <w:pPr>
+        <w:pStyle w:val="ListParagraph"/>
+        <w:numPr>
+          <w:ilvl w:val="2"/>
+          <w:numId w:val="2"/>
+        </w:numPr>
+      </w:pPr>
+      <w:r>
+        <w:t xml:space="preserve">[ESP32] Wi-Fi Marauder app (found in GPIO menu). </w:t>
+      </w:r>
+    </w:p>
+    <w:p>
+      <w:pPr>
+        <w:pStyle w:val="ListParagraph"/>
+        <w:numPr>
+          <w:ilvl w:val="1"/>
+          <w:numId w:val="2"/>
+        </w:numPr>
+        <w:rPr>
+          <w:b/>
+          <w:bCs/>
+          <w:sz w:val="32"/>
+          <w:szCs w:val="32"/>
+          <w:highlight w:val="cyan"/>
+        </w:rPr>
+      </w:pPr>
+      <w:r>
+        <w:rPr>
+          <w:b/>
+          <w:bCs/>
+          <w:sz w:val="32"/>
+          <w:szCs w:val="32"/>
+          <w:highlight w:val="cyan"/>
+        </w:rPr>
+        <w:t xml:space="preserve">SD Card Files: </w:t>
+      </w:r>
+    </w:p>
+    <w:p>
+      <w:pPr>
+        <w:pStyle w:val="ListParagraph"/>
+        <w:numPr>
+          <w:ilvl w:val="2"/>
+          <w:numId w:val="2"/>
+        </w:numPr>
+        <w:rPr>
+          <w:b/>
+          <w:bCs/>
+          <w:sz w:val="28"/>
+          <w:szCs w:val="28"/>
+          <w:highlight w:val="yellow"/>
+          <w:u w:val="single"/>
+        </w:rPr>
+      </w:pPr>
+      <w:r>
+        <w:rPr>
+          <w:b/>
+          <w:bCs/>
+          <w:sz w:val="28"/>
+          <w:szCs w:val="28"/>
+          <w:highlight w:val="yellow"/>
+          <w:u w:val="single"/>
+        </w:rPr>
+        <w:t xml:space="preserve">Captive portal HTML files </w:t>
+      </w:r>
+    </w:p>
+    <w:p>
+      <w:pPr>
+        <w:pStyle w:val="ListParagraph"/>
+        <w:numPr>
+          <w:ilvl w:val="3"/>
+          <w:numId w:val="2"/>
+        </w:numPr>
+      </w:pPr>
+      <w:r>
+        <w:t xml:space="preserve">If you do not have a HTML captive portal file (e.g., index.file) there will be no sign-in page for the target to insert their credentials. </w:t>
+      </w:r>
+    </w:p>
+    <w:p>
+      <w:pPr>
+        <w:pStyle w:val="ListParagraph"/>
+        <w:numPr>
+          <w:ilvl w:val="0"/>
+          <w:numId w:val="2"/>
+        </w:numPr>
+        <w:rPr>
+          <w:b/>
+          <w:bCs/>
+          <w:sz w:val="36"/>
+          <w:szCs w:val="36"/>
+          <w:highlight w:val="yellow"/>
+          <w:u w:val="single"/>
+        </w:rPr>
+      </w:pPr>
+      <w:r>
+        <w:rPr>
+          <w:b/>
+          <w:bCs/>
+          <w:sz w:val="36"/>
+          <w:szCs w:val="36"/>
+          <w:highlight w:val="yellow"/>
+          <w:u w:val="single"/>
+        </w:rPr>
+        <w:t>Identify the Target:</w:t>
+      </w:r>
+    </w:p>
+    <w:p>
+      <w:pPr>
+        <w:pStyle w:val="ListParagraph"/>
+        <w:numPr>
+          <w:ilvl w:val="1"/>
+          <w:numId w:val="2"/>
+        </w:numPr>
+      </w:pPr>
+      <w:r>
+        <w:t xml:space="preserve">Open the Wi-Fi Marauder app on the Flipper. </w:t>
+      </w:r>
+    </w:p>
+    <w:p>
+      <w:pPr>
+        <w:pStyle w:val="ListParagraph"/>
+        <w:numPr>
+          <w:ilvl w:val="1"/>
+          <w:numId w:val="2"/>
+        </w:numPr>
+      </w:pPr>
+      <w:r>
+        <w:t xml:space="preserve">Select Scan &gt; AP scan to find local networks </w:t>
+      </w:r>
+    </w:p>
+    <w:p>
+      <w:pPr>
+        <w:pStyle w:val="ListParagraph"/>
+        <w:numPr>
+          <w:ilvl w:val="1"/>
+          <w:numId w:val="2"/>
+        </w:numPr>
+      </w:pPr>
+      <w:r>
+        <w:t xml:space="preserve">Once the scan finishes go to the List &gt; Aps and take note of the index number for your target SSID. </w:t>
+      </w:r>
+    </w:p>
+    <w:p>
+      <w:pPr>
+        <w:pStyle w:val="ListParagraph"/>
+        <w:numPr>
+          <w:ilvl w:val="2"/>
+          <w:numId w:val="2"/>
+        </w:numPr>
+      </w:pPr>
+      <w:r>
+        <w:t xml:space="preserve">Or go to Select &gt; APs and enter the index number of the target network to “clone” it. </w:t>
+      </w:r>
+    </w:p>
+    <w:p>
+      <w:pPr>
+        <w:pStyle w:val="ListParagraph"/>
+        <w:numPr>
+          <w:ilvl w:val="2"/>
+          <w:numId w:val="2"/>
+        </w:numPr>
+      </w:pPr>
+      <w:r>
+        <w:t xml:space="preserve">Alternatively, manually add a name via SSID &gt; Add Name if you want to create a new one like “Free_Airport_Wifi” </w:t>
+      </w:r>
+    </w:p>
+    <w:p>
+      <w:pPr>
+        <w:pStyle w:val="ListParagraph"/>
+        <w:numPr>
+          <w:ilvl w:val="3"/>
+          <w:numId w:val="2"/>
+        </w:numPr>
+        <w:rPr>
+          <w:b/>
+          <w:bCs/>
+          <w:sz w:val="28"/>
+          <w:szCs w:val="28"/>
+          <w:highlight w:val="yellow"/>
+          <w:u w:val="single"/>
+        </w:rPr>
+      </w:pPr>
+      <w:r>
+        <w:rPr>
+          <w:b/>
+          <w:bCs/>
+          <w:sz w:val="28"/>
+          <w:szCs w:val="28"/>
+          <w:highlight w:val="yellow"/>
+          <w:u w:val="single"/>
+        </w:rPr>
+        <w:t>Adding SSID:</w:t>
+      </w:r>
+    </w:p>
+    <w:p>
+      <w:pPr>
+        <w:pStyle w:val="ListParagraph"/>
+        <w:numPr>
+          <w:ilvl w:val="4"/>
+          <w:numId w:val="2"/>
+        </w:numPr>
+      </w:pPr>
+      <w:r>
+        <w:t>After typing in the name you want verify the list</w:t>
+      </w:r>
+    </w:p>
+    <w:p>
+      <w:pPr>
+        <w:pStyle w:val="ListParagraph"/>
+        <w:numPr>
+          <w:ilvl w:val="5"/>
+          <w:numId w:val="2"/>
+        </w:numPr>
+      </w:pPr>
+      <w:r>
+        <w:t xml:space="preserve">Go back to the SSID menu </w:t>
+      </w:r>
+    </w:p>
+    <w:p>
+      <w:pPr>
+        <w:pStyle w:val="ListParagraph"/>
+        <w:numPr>
+          <w:ilvl w:val="5"/>
+          <w:numId w:val="2"/>
+        </w:numPr>
+      </w:pPr>
+      <w:r>
+        <w:t>Select List Names</w:t>
+      </w:r>
+    </w:p>
+    <w:p>
+      <w:pPr>
+        <w:pStyle w:val="ListParagraph"/>
+        <w:numPr>
+          <w:ilvl w:val="5"/>
+          <w:numId w:val="2"/>
+        </w:numPr>
+      </w:pPr>
+      <w:r>
+        <w:t xml:space="preserve">Ensure the added SSIDs appear here. </w:t>
+      </w:r>
+    </w:p>
+    <w:p>
+      <w:pPr>
+        <w:pStyle w:val="ListParagraph"/>
+        <w:numPr>
+          <w:ilvl w:val="6"/>
+          <w:numId w:val="2"/>
+        </w:numPr>
+      </w:pPr>
+      <w:r>
+        <w:t xml:space="preserve">If old names appear use the Clear All and re-add only the one you want to use. </w:t>
+      </w:r>
+    </w:p>
+    <w:p>
+      <w:pPr>
+        <w:pStyle w:val="ListParagraph"/>
+        <w:numPr>
+          <w:ilvl w:val="0"/>
+          <w:numId w:val="2"/>
+        </w:numPr>
+      </w:pPr>
+      <w:r>
+        <w:rPr>
+          <w:b/>
+          <w:bCs/>
+          <w:sz w:val="36"/>
+          <w:szCs w:val="36"/>
+          <w:highlight w:val="yellow"/>
+          <w:u w:val="single"/>
+        </w:rPr>
+        <w:t>Load the Captive Portal</w:t>
+      </w:r>
+      <w:r>
+        <w:t>:</w:t>
+      </w:r>
+    </w:p>
+    <w:p>
+      <w:pPr>
+        <w:pStyle w:val="ListParagraph"/>
+        <w:numPr>
+          <w:ilvl w:val="1"/>
+          <w:numId w:val="2"/>
+        </w:numPr>
+        <w:rPr>
+          <w:b/>
+          <w:bCs/>
+          <w:sz w:val="32"/>
+          <w:szCs w:val="32"/>
+          <w:highlight w:val="cyan"/>
+        </w:rPr>
+      </w:pPr>
+      <w:r>
+        <w:rPr>
+          <w:b/>
+          <w:bCs/>
+          <w:sz w:val="32"/>
+          <w:szCs w:val="32"/>
+          <w:highlight w:val="cyan"/>
+        </w:rPr>
+        <w:t xml:space="preserve">Select Load Evil Portal HTML file. </w:t>
+      </w:r>
+    </w:p>
+    <w:p>
+      <w:pPr>
+        <w:pStyle w:val="ListParagraph"/>
+        <w:numPr>
+          <w:ilvl w:val="2"/>
+          <w:numId w:val="2"/>
+        </w:numPr>
+      </w:pPr>
+      <w:r>
+        <w:t xml:space="preserve">If your folders are empty, you can find community-made captive portals (Google, Facebook, Starbucks, etc.) on </w:t>
+      </w:r>
+      <w:hyperlink r:id="rId5" w:tgtFrame="_blank" w:history="1">
+        <w:r>
+          <w:rPr>
+            <w:rStyle w:val="Hyperlink"/>
+          </w:rPr>
+          <w:t>GitHub repositories like bigbrodude6119's</w:t>
+        </w:r>
+      </w:hyperlink>
+      <w:r>
+        <w:t>. </w:t>
+      </w:r>
+    </w:p>
+    <w:p>
+      <w:pPr>
+        <w:pStyle w:val="ListParagraph"/>
+        <w:numPr>
+          <w:ilvl w:val="1"/>
+          <w:numId w:val="2"/>
+        </w:numPr>
+      </w:pPr>
+      <w:r>
+        <w:t xml:space="preserve">Browse your SD card and select the desired portal. </w:t>
+      </w:r>
+    </w:p>
+    <w:p>
+      <w:pPr>
+        <w:pStyle w:val="ListParagraph"/>
+        <w:numPr>
+          <w:ilvl w:val="0"/>
+          <w:numId w:val="2"/>
+        </w:numPr>
+        <w:rPr>
+          <w:b/>
+          <w:bCs/>
+          <w:sz w:val="36"/>
+          <w:szCs w:val="36"/>
+          <w:highlight w:val="yellow"/>
+          <w:u w:val="single"/>
+        </w:rPr>
+      </w:pPr>
+      <w:r>
+        <w:rPr>
+          <w:b/>
+          <w:bCs/>
+          <w:sz w:val="36"/>
+          <w:szCs w:val="36"/>
+          <w:highlight w:val="yellow"/>
+          <w:u w:val="single"/>
+        </w:rPr>
+        <w:lastRenderedPageBreak/>
+        <w:t>Launch the Attack:</w:t>
+      </w:r>
+    </w:p>
+    <w:p>
+      <w:pPr>
+        <w:pStyle w:val="ListParagraph"/>
+        <w:numPr>
+          <w:ilvl w:val="1"/>
+          <w:numId w:val="2"/>
+        </w:numPr>
+      </w:pPr>
+      <w:r>
+        <w:t xml:space="preserve">Select Evil Portal &gt; Start. </w:t>
+      </w:r>
+    </w:p>
+    <w:p>
+      <w:pPr>
+        <w:pStyle w:val="ListParagraph"/>
+        <w:numPr>
+          <w:ilvl w:val="0"/>
+          <w:numId w:val="2"/>
+        </w:numPr>
+        <w:rPr>
+          <w:b/>
+          <w:bCs/>
+          <w:sz w:val="36"/>
+          <w:szCs w:val="36"/>
+          <w:highlight w:val="yellow"/>
+          <w:u w:val="single"/>
+        </w:rPr>
+      </w:pPr>
+      <w:r>
+        <w:rPr>
+          <w:b/>
+          <w:bCs/>
+          <w:sz w:val="36"/>
+          <w:szCs w:val="36"/>
+          <w:highlight w:val="yellow"/>
+          <w:u w:val="single"/>
+        </w:rPr>
+        <w:t>Capturing data:</w:t>
+      </w:r>
+    </w:p>
+    <w:p>
+      <w:pPr>
+        <w:pStyle w:val="ListParagraph"/>
+        <w:numPr>
+          <w:ilvl w:val="1"/>
+          <w:numId w:val="2"/>
+        </w:numPr>
+      </w:pPr>
+      <w:r>
+        <w:t xml:space="preserve">When a victim connects, their device will automatically open your captive portal. </w:t>
+      </w:r>
+    </w:p>
+    <w:p>
+      <w:pPr>
+        <w:pStyle w:val="ListParagraph"/>
+        <w:numPr>
+          <w:ilvl w:val="1"/>
+          <w:numId w:val="2"/>
+        </w:numPr>
+      </w:pPr>
+      <w:r>
+        <w:t xml:space="preserve">Any credentials entered will appear in real-time on the Flipper screen and be saved to the </w:t>
+      </w:r>
+      <w:r>
+        <w:rPr>
+          <w:b/>
+          <w:bCs/>
+          <w:u w:val="single"/>
+        </w:rPr>
+        <w:t>logs &gt; /app_data/marauder/logs</w:t>
+      </w:r>
+      <w:r>
+        <w:t>.</w:t>
+      </w:r>
+    </w:p>
+    <w:p>
+      <w:pPr>
+        <w:pStyle w:val="ListParagraph"/>
+        <w:numPr>
+          <w:ilvl w:val="1"/>
+          <w:numId w:val="2"/>
+        </w:numPr>
+        <w:rPr>
+          <w:b/>
+          <w:bCs/>
+          <w:sz w:val="32"/>
+          <w:szCs w:val="32"/>
+          <w:highlight w:val="cyan"/>
+        </w:rPr>
+      </w:pPr>
+      <w:r>
+        <w:rPr>
+          <w:b/>
+          <w:bCs/>
+          <w:sz w:val="32"/>
+          <w:szCs w:val="32"/>
+          <w:highlight w:val="cyan"/>
+        </w:rPr>
+        <w:t xml:space="preserve">Watch the flipper screen </w:t>
+      </w:r>
+    </w:p>
+    <w:p>
+      <w:pPr>
+        <w:pStyle w:val="ListParagraph"/>
+        <w:numPr>
+          <w:ilvl w:val="2"/>
+          <w:numId w:val="2"/>
+        </w:numPr>
+      </w:pPr>
+      <w:r>
+        <w:t xml:space="preserve">The marauder app will display logs in real-time. </w:t>
+      </w:r>
+    </w:p>
+    <w:p>
+      <w:pPr>
+        <w:pStyle w:val="ListParagraph"/>
+        <w:numPr>
+          <w:ilvl w:val="2"/>
+          <w:numId w:val="2"/>
+        </w:numPr>
+      </w:pPr>
+      <w:r>
+        <w:t xml:space="preserve">You will see “POST” requests or text strings appearing on the screen. </w:t>
+      </w:r>
+    </w:p>
+    <w:p>
+      <w:pPr>
+        <w:pStyle w:val="ListParagraph"/>
+        <w:numPr>
+          <w:ilvl w:val="3"/>
+          <w:numId w:val="2"/>
+        </w:numPr>
+      </w:pPr>
+      <w:r>
+        <w:t xml:space="preserve">These usually contain the credentials entered. </w:t>
+      </w:r>
+    </w:p>
+    <w:p>
+      <w:pPr>
+        <w:pStyle w:val="ListParagraph"/>
+        <w:numPr>
+          <w:ilvl w:val="1"/>
+          <w:numId w:val="2"/>
+        </w:numPr>
+        <w:rPr>
+          <w:b/>
+          <w:bCs/>
+          <w:sz w:val="32"/>
+          <w:szCs w:val="32"/>
+          <w:highlight w:val="cyan"/>
+        </w:rPr>
+      </w:pPr>
+      <w:r>
+        <w:rPr>
+          <w:b/>
+          <w:bCs/>
+          <w:sz w:val="32"/>
+          <w:szCs w:val="32"/>
+          <w:highlight w:val="cyan"/>
+        </w:rPr>
+        <w:t>Check the logs later:</w:t>
+      </w:r>
+    </w:p>
+    <w:p>
+      <w:pPr>
+        <w:pStyle w:val="ListParagraph"/>
+        <w:numPr>
+          <w:ilvl w:val="2"/>
+          <w:numId w:val="2"/>
+        </w:numPr>
+      </w:pPr>
+      <w:r>
+        <w:t>The credentials are automatically saved to your SD card.</w:t>
+      </w:r>
+    </w:p>
+    <w:p>
+      <w:pPr>
+        <w:pStyle w:val="ListParagraph"/>
+        <w:numPr>
+          <w:ilvl w:val="2"/>
+          <w:numId w:val="2"/>
+        </w:numPr>
+      </w:pPr>
+      <w:r>
+        <w:t>Path: /apps_data/marauder/logs/</w:t>
+      </w:r>
+    </w:p>
+    <w:p>
+      <w:pPr>
+        <w:pStyle w:val="ListParagraph"/>
+        <w:numPr>
+          <w:ilvl w:val="2"/>
+          <w:numId w:val="2"/>
+        </w:numPr>
+      </w:pPr>
+      <w:r>
+        <w:t>Look for files ending in .log or labeled portal_data.</w:t>
+      </w:r>
+    </w:p>
+    <w:p>
+      <w:pPr>
+        <w:pStyle w:val="ListParagraph"/>
+        <w:numPr>
+          <w:ilvl w:val="0"/>
+          <w:numId w:val="2"/>
+        </w:numPr>
+      </w:pPr>
+      <w:r>
+        <w:rPr>
+          <w:b/>
+          <w:bCs/>
+          <w:color w:val="EE0000"/>
+        </w:rPr>
+        <w:t>Note</w:t>
+      </w:r>
+      <w:r>
+        <w:t xml:space="preserve">: </w:t>
+      </w:r>
+      <w:r>
+        <w:t>Understanding these techniques is vital for cybersecurity professionals and researchers to develop better defenses against credential harvesting and unauthorized access.</w:t>
+      </w:r>
+    </w:p>
+    <w:p>
+      <w:pPr>
+        <w:pStyle w:val="ListParagraph"/>
+        <w:numPr>
+          <w:ilvl w:val="1"/>
+          <w:numId w:val="2"/>
+        </w:numPr>
+        <w:rPr>
+          <w:sz w:val="32"/>
+          <w:szCs w:val="32"/>
+          <w:highlight w:val="cyan"/>
+        </w:rPr>
+      </w:pPr>
+      <w:r>
+        <w:rPr>
+          <w:b/>
+          <w:bCs/>
+          <w:sz w:val="32"/>
+          <w:szCs w:val="32"/>
+          <w:highlight w:val="cyan"/>
+        </w:rPr>
+        <w:t>Connect Flipper:</w:t>
+      </w:r>
+    </w:p>
+    <w:p>
+      <w:pPr>
+        <w:pStyle w:val="ListParagraph"/>
+        <w:numPr>
+          <w:ilvl w:val="2"/>
+          <w:numId w:val="2"/>
+        </w:numPr>
+      </w:pPr>
+      <w:r>
+        <w:t xml:space="preserve">Make sure your .html files are in exactly this location: </w:t>
+      </w:r>
+    </w:p>
+    <w:p>
+      <w:pPr>
+        <w:pStyle w:val="ListParagraph"/>
+        <w:numPr>
+          <w:ilvl w:val="3"/>
+          <w:numId w:val="2"/>
+        </w:numPr>
+      </w:pPr>
+      <w:r>
+        <w:t xml:space="preserve">Sd Card / apps_data / marauder / html / </w:t>
+      </w:r>
+    </w:p>
+    <w:p>
+      <w:pPr>
+        <w:pStyle w:val="ListParagraph"/>
+        <w:numPr>
+          <w:ilvl w:val="3"/>
+          <w:numId w:val="2"/>
+        </w:numPr>
+      </w:pPr>
+      <w:r>
+        <w:t xml:space="preserve">Ensure folder names are lowercase. </w:t>
+      </w:r>
+    </w:p>
+    <w:p>
+      <w:pPr>
+        <w:pStyle w:val="ListParagraph"/>
+        <w:numPr>
+          <w:ilvl w:val="1"/>
+          <w:numId w:val="2"/>
+        </w:numPr>
+        <w:rPr>
+          <w:b/>
+          <w:bCs/>
+          <w:sz w:val="32"/>
+          <w:szCs w:val="32"/>
+          <w:highlight w:val="cyan"/>
+        </w:rPr>
+      </w:pPr>
+      <w:r>
+        <w:rPr>
+          <w:b/>
+          <w:bCs/>
+          <w:sz w:val="32"/>
+          <w:szCs w:val="32"/>
+          <w:highlight w:val="cyan"/>
+        </w:rPr>
+        <w:t xml:space="preserve">If people aren’t connecting: </w:t>
+      </w:r>
+    </w:p>
+    <w:p>
+      <w:pPr>
+        <w:pStyle w:val="ListParagraph"/>
+        <w:numPr>
+          <w:ilvl w:val="2"/>
+          <w:numId w:val="2"/>
+        </w:numPr>
+      </w:pPr>
+      <w:r>
+        <w:t xml:space="preserve">Use the SSID Deauth or Beacon Spam functions on the original network. </w:t>
+      </w:r>
+    </w:p>
+    <w:p>
+      <w:pPr>
+        <w:pStyle w:val="ListParagraph"/>
+        <w:numPr>
+          <w:ilvl w:val="3"/>
+          <w:numId w:val="2"/>
+        </w:numPr>
+      </w:pPr>
+      <w:r>
+        <w:t xml:space="preserve">This kicks users off the real WiFi so their phones look for a new one. </w:t>
+      </w:r>
+    </w:p>
+    <w:p>
+      <w:pPr>
+        <w:pStyle w:val="ListParagraph"/>
+        <w:numPr>
+          <w:ilvl w:val="1"/>
+          <w:numId w:val="2"/>
+        </w:numPr>
+        <w:rPr>
+          <w:b/>
+          <w:bCs/>
+          <w:sz w:val="32"/>
+          <w:szCs w:val="32"/>
+          <w:highlight w:val="cyan"/>
+        </w:rPr>
+      </w:pPr>
+      <w:r>
+        <w:rPr>
+          <w:b/>
+          <w:bCs/>
+          <w:sz w:val="32"/>
+          <w:szCs w:val="32"/>
+          <w:highlight w:val="cyan"/>
+        </w:rPr>
+        <w:t xml:space="preserve">When you connect show “No Internet” </w:t>
+      </w:r>
+    </w:p>
+    <w:p>
+      <w:pPr>
+        <w:pStyle w:val="ListParagraph"/>
+        <w:numPr>
+          <w:ilvl w:val="2"/>
+          <w:numId w:val="2"/>
+        </w:numPr>
+      </w:pPr>
+      <w:r>
+        <w:t xml:space="preserve">This is because you want to force the user to think they are logging in and put in their credentials. </w:t>
+      </w:r>
+    </w:p>
+    <w:p>
+      <w:pPr>
+        <w:pStyle w:val="ListParagraph"/>
+        <w:numPr>
+          <w:ilvl w:val="3"/>
+          <w:numId w:val="2"/>
+        </w:numPr>
+      </w:pPr>
+      <w:r>
+        <w:t xml:space="preserve">The goal: To trick the device into thinking it needs to sign in to get internet. </w:t>
+      </w:r>
+    </w:p>
+    <w:p>
+      <w:pPr>
+        <w:pStyle w:val="ListParagraph"/>
+        <w:numPr>
+          <w:ilvl w:val="3"/>
+          <w:numId w:val="2"/>
+        </w:numPr>
+      </w:pPr>
+      <w:r>
+        <w:t xml:space="preserve">The trap: When the phone sees there is no internet, it triggers the Captive Portal mechanism to show your fake login page. </w:t>
+      </w:r>
+    </w:p>
+    <w:p>
+      <w:pPr>
+        <w:pStyle w:val="ListParagraph"/>
+        <w:numPr>
+          <w:ilvl w:val="1"/>
+          <w:numId w:val="2"/>
+        </w:numPr>
+        <w:rPr>
+          <w:sz w:val="32"/>
+          <w:szCs w:val="32"/>
+          <w:highlight w:val="cyan"/>
+        </w:rPr>
+      </w:pPr>
+      <w:r>
+        <w:rPr>
+          <w:b/>
+          <w:bCs/>
+          <w:sz w:val="32"/>
+          <w:szCs w:val="32"/>
+          <w:highlight w:val="cyan"/>
+        </w:rPr>
+        <w:t>Cloning</w:t>
+      </w:r>
+      <w:r>
+        <w:rPr>
+          <w:sz w:val="32"/>
+          <w:szCs w:val="32"/>
+          <w:highlight w:val="cyan"/>
+        </w:rPr>
+        <w:t xml:space="preserve">: </w:t>
+      </w:r>
+    </w:p>
+    <w:p>
+      <w:pPr>
+        <w:pStyle w:val="ListParagraph"/>
+        <w:numPr>
+          <w:ilvl w:val="2"/>
+          <w:numId w:val="2"/>
+        </w:numPr>
+      </w:pPr>
+      <w:r>
+        <w:t>You can use "View Source" on a real login page (like a coffee shop's portal), copy the code, and replace their &lt;form&gt; action with action="/"</w:t>
+      </w:r>
+    </w:p>
+    <w:p>
+      <w:pPr>
+        <w:pStyle w:val="ListParagraph"/>
+        <w:numPr>
+          <w:ilvl w:val="1"/>
+          <w:numId w:val="2"/>
+        </w:numPr>
+        <w:rPr>
+          <w:sz w:val="32"/>
+          <w:szCs w:val="32"/>
+          <w:highlight w:val="cyan"/>
+        </w:rPr>
+      </w:pPr>
+      <w:r>
+        <w:rPr>
+          <w:b/>
+          <w:bCs/>
+          <w:sz w:val="32"/>
+          <w:szCs w:val="32"/>
+          <w:highlight w:val="cyan"/>
+        </w:rPr>
+        <w:lastRenderedPageBreak/>
+        <w:t>Images</w:t>
+      </w:r>
+      <w:r>
+        <w:rPr>
+          <w:sz w:val="32"/>
+          <w:szCs w:val="32"/>
+          <w:highlight w:val="cyan"/>
+        </w:rPr>
+        <w:t xml:space="preserve">: </w:t>
+      </w:r>
+    </w:p>
+    <w:p>
+      <w:pPr>
+        <w:pStyle w:val="ListParagraph"/>
+        <w:numPr>
+          <w:ilvl w:val="2"/>
+          <w:numId w:val="2"/>
+        </w:numPr>
+      </w:pPr>
+      <w:r>
+        <w:t xml:space="preserve">The ESP32 cannot easily host images. It is better to use </w:t>
+      </w:r>
+      <w:r>
+        <w:rPr>
+          <w:b/>
+          <w:bCs/>
+        </w:rPr>
+        <w:t>CSS colors</w:t>
+      </w:r>
+      <w:r>
+        <w:t xml:space="preserve"> and </w:t>
+      </w:r>
+      <w:r>
+        <w:rPr>
+          <w:b/>
+          <w:bCs/>
+        </w:rPr>
+        <w:t>text</w:t>
+      </w:r>
+      <w:r>
+        <w:t xml:space="preserve"> instead of heavy logos, or use a "Base64" encoded image if you really need a logo.</w:t>
+      </w:r>
+    </w:p>
+    <w:p>
+      <w:pPr>
+        <w:pStyle w:val="ListParagraph"/>
+        <w:numPr>
+          <w:ilvl w:val="1"/>
+          <w:numId w:val="2"/>
+        </w:numPr>
+        <w:rPr>
+          <w:b/>
+          <w:bCs/>
+          <w:sz w:val="32"/>
+          <w:szCs w:val="32"/>
+          <w:highlight w:val="cyan"/>
+        </w:rPr>
+      </w:pPr>
+      <w:r>
+        <w:rPr>
+          <w:b/>
+          <w:bCs/>
+          <w:sz w:val="32"/>
+          <w:szCs w:val="32"/>
+          <w:highlight w:val="cyan"/>
+        </w:rPr>
+        <w:t>Critical Code:</w:t>
+      </w:r>
+    </w:p>
+    <w:p>
+      <w:pPr>
+        <w:pStyle w:val="ListParagraph"/>
+        <w:numPr>
+          <w:ilvl w:val="2"/>
+          <w:numId w:val="2"/>
+        </w:numPr>
+      </w:pPr>
+      <w:r>
+        <w:t>For the Flipper to “see” the Password, your HTML &lt;form&gt; tag must look like this:</w:t>
+      </w:r>
+    </w:p>
+    <w:p>
+      <w:pPr>
+        <w:pStyle w:val="ListParagraph"/>
+        <w:numPr>
+          <w:ilvl w:val="3"/>
+          <w:numId w:val="2"/>
+        </w:numPr>
+      </w:pPr>
+      <w:r>
+        <w:t xml:space="preserve">Type, </w:t>
+      </w:r>
+      <w:r>
+        <w:rPr>
+          <w:b/>
+          <w:bCs/>
+          <w:i/>
+          <w:iCs/>
+        </w:rPr>
+        <w:t>&lt;form method="POST" action="/"&gt;</w:t>
+      </w:r>
+    </w:p>
+    <w:p>
+      <w:pPr>
+        <w:pStyle w:val="ListParagraph"/>
+        <w:numPr>
+          <w:ilvl w:val="4"/>
+          <w:numId w:val="2"/>
+        </w:numPr>
+      </w:pPr>
+      <w:r>
+        <w:rPr>
+          <w:b/>
+          <w:bCs/>
+          <w:i/>
+          <w:iCs/>
+        </w:rPr>
+        <w:t>Method=</w:t>
+      </w:r>
+      <w:r>
+        <w:rPr>
+          <w:i/>
+          <w:iCs/>
+        </w:rPr>
+        <w:t>”Post”</w:t>
+      </w:r>
+    </w:p>
+    <w:p>
+      <w:pPr>
+        <w:pStyle w:val="ListParagraph"/>
+        <w:numPr>
+          <w:ilvl w:val="5"/>
+          <w:numId w:val="2"/>
+        </w:numPr>
+      </w:pPr>
+      <w:r>
+        <w:t>This tells the browser to “send” data</w:t>
+      </w:r>
+    </w:p>
+    <w:p>
+      <w:pPr>
+        <w:pStyle w:val="ListParagraph"/>
+        <w:numPr>
+          <w:ilvl w:val="4"/>
+          <w:numId w:val="2"/>
+        </w:numPr>
+      </w:pPr>
+      <w:r>
+        <w:rPr>
+          <w:b/>
+          <w:bCs/>
+          <w:i/>
+          <w:iCs/>
+        </w:rPr>
+        <w:t>Action=</w:t>
+      </w:r>
+      <w:r>
+        <w:rPr>
+          <w:i/>
+          <w:iCs/>
+        </w:rPr>
+        <w:t>”/”</w:t>
+      </w:r>
+      <w:r>
+        <w:t xml:space="preserve"> </w:t>
+      </w:r>
+    </w:p>
+    <w:p>
+      <w:pPr>
+        <w:pStyle w:val="ListParagraph"/>
+        <w:numPr>
+          <w:ilvl w:val="5"/>
+          <w:numId w:val="2"/>
+        </w:numPr>
+      </w:pPr>
+      <w:r>
+        <w:t xml:space="preserve">This sends the data directly to the ESP32 Marauder. </w:t>
+      </w:r>
+    </w:p>
+    <w:p>
+      <w:pPr>
+        <w:pStyle w:val="ListParagraph"/>
+        <w:numPr>
+          <w:ilvl w:val="1"/>
+          <w:numId w:val="2"/>
+        </w:numPr>
+      </w:pPr>
+      <w:r>
+        <w:rPr>
+          <w:b/>
+          <w:bCs/>
+        </w:rPr>
+        <w:t>Example</w:t>
+      </w:r>
+      <w:r>
+        <w:t xml:space="preserve"> of template: </w:t>
+      </w:r>
+    </w:p>
+    <w:p>
+      <w:pPr>
+        <w:ind w:left="720" w:firstLine="720"/>
+      </w:pPr>
+      <w:r>
+        <w:t>&lt;!DOCTYPE html&gt;</w:t>
+      </w:r>
+    </w:p>
+    <w:p>
+      <w:pPr>
+        <w:ind w:left="720" w:firstLine="720"/>
+      </w:pPr>
+      <w:r>
+        <w:t>&lt;html&gt;</w:t>
+      </w:r>
+    </w:p>
+    <w:p>
+      <w:pPr>
+        <w:ind w:left="720" w:firstLine="720"/>
+      </w:pPr>
+      <w:r>
+        <w:t>&lt;head&gt;</w:t>
+      </w:r>
+    </w:p>
+    <w:p>
+      <w:pPr>
+        <w:ind w:left="720" w:firstLine="720"/>
+      </w:pPr>
+      <w:r>
+        <w:t xml:space="preserve">    &lt;title&gt;WiFi Login&lt;/title&gt;</w:t>
+      </w:r>
+    </w:p>
+    <w:p>
+      <w:pPr>
+        <w:ind w:left="720" w:firstLine="720"/>
+      </w:pPr>
+      <w:r>
+        <w:t xml:space="preserve">    &lt;meta name="viewport" content="width=device-width, initial-scale=1"&gt;</w:t>
+      </w:r>
+    </w:p>
+    <w:p>
+      <w:pPr>
+        <w:ind w:left="720" w:firstLine="720"/>
+      </w:pPr>
+      <w:r>
+        <w:t xml:space="preserve">    &lt;style&gt;</w:t>
+      </w:r>
+    </w:p>
+    <w:p>
+      <w:pPr>
+        <w:ind w:left="720" w:firstLine="720"/>
+      </w:pPr>
+      <w:r>
+        <w:t xml:space="preserve">        body { font-family: Arial; text-align: center; padding: 50px; }</w:t>
+      </w:r>
+    </w:p>
+    <w:p>
+      <w:pPr>
+        <w:ind w:left="720" w:firstLine="720"/>
+      </w:pPr>
+      <w:r>
+        <w:t xml:space="preserve">        input { width: 80%; padding: 10px; margin: 10px; }</w:t>
+      </w:r>
+    </w:p>
+    <w:p>
+      <w:pPr>
+        <w:ind w:left="720" w:firstLine="720"/>
+      </w:pPr>
+      <w:r>
+        <w:t xml:space="preserve">        button { background: #007bff; color: white; padding: 10px 20px; border: none; }</w:t>
+      </w:r>
+    </w:p>
+    <w:p>
+      <w:pPr>
+        <w:ind w:left="720" w:firstLine="720"/>
+      </w:pPr>
+      <w:r>
+        <w:t xml:space="preserve">    &lt;/style&gt;</w:t>
+      </w:r>
+    </w:p>
+    <w:p>
+      <w:pPr>
+        <w:ind w:left="720" w:firstLine="720"/>
+      </w:pPr>
+      <w:r>
+        <w:t>&lt;/head&gt;</w:t>
+      </w:r>
+    </w:p>
+    <w:p>
+      <w:pPr>
+        <w:ind w:left="720" w:firstLine="720"/>
+      </w:pPr>
+      <w:r>
+        <w:t>&lt;body&gt;</w:t>
+      </w:r>
+    </w:p>
+    <w:p>
+      <w:pPr>
+        <w:ind w:left="720" w:firstLine="720"/>
+      </w:pPr>
+      <w:r>
+        <w:t xml:space="preserve">    &lt;h2&gt;Log in to continue&lt;/h2&gt;</w:t>
+      </w:r>
+    </w:p>
+    <w:p>
+      <w:pPr>
+        <w:ind w:left="720" w:firstLine="720"/>
+      </w:pPr>
+      <w:r>
+        <w:t xml:space="preserve">    &lt;p&gt;Please log in with your email to access the internet.&lt;/p&gt;</w:t>
+      </w:r>
+    </w:p>
+    <w:p>
+      <w:pPr>
+        <w:ind w:left="720" w:firstLine="720"/>
+        <w:rPr>
+          <w:b/>
+          <w:bCs/>
+        </w:rPr>
+      </w:pPr>
+      <w:r>
+        <w:rPr>
+          <w:b/>
+          <w:bCs/>
+        </w:rPr>
+        <w:t xml:space="preserve">    </w:t>
+      </w:r>
+      <w:r>
+        <w:rPr>
+          <w:b/>
+          <w:bCs/>
+          <w:highlight w:val="yellow"/>
+        </w:rPr>
+        <w:t>&lt;form method="POST" action="/"&gt;</w:t>
+      </w:r>
+    </w:p>
+    <w:p>
+      <w:pPr>
+        <w:ind w:left="720" w:firstLine="720"/>
+      </w:pPr>
+      <w:r>
+        <w:lastRenderedPageBreak/>
+        <w:t xml:space="preserve">        &lt;input type="text" name="email" placeholder="Email Address" required&gt;&lt;br&gt;</w:t>
+      </w:r>
+    </w:p>
+    <w:p>
+      <w:pPr>
+        <w:ind w:left="720" w:firstLine="720"/>
+      </w:pPr>
+      <w:r>
+        <w:t xml:space="preserve">        &lt;input type="password" name="password" placeholder="Password" required&gt;&lt;br&gt;</w:t>
+      </w:r>
+    </w:p>
+    <w:p>
+      <w:pPr>
+        <w:ind w:left="720" w:firstLine="720"/>
+      </w:pPr>
+      <w:r>
+        <w:t xml:space="preserve">        &lt;button type="submit"&gt;Login&lt;/button&gt;</w:t>
+      </w:r>
+    </w:p>
+    <w:p>
+      <w:pPr>
+        <w:ind w:left="720" w:firstLine="720"/>
+      </w:pPr>
+      <w:r>
+        <w:t xml:space="preserve">    &lt;/form&gt;</w:t>
+      </w:r>
+    </w:p>
+    <w:p>
+      <w:pPr>
+        <w:ind w:left="720" w:firstLine="720"/>
+      </w:pPr>
+      <w:r>
+        <w:t>&lt;/body&gt;</w:t>
+      </w:r>
+    </w:p>
+    <w:p>
+      <w:pPr>
+        <w:ind w:left="720" w:firstLine="720"/>
+      </w:pPr>
+      <w:r>
+        <w:t>&lt;/html&gt;</w:t>
+      </w:r>
+    </w:p>
+    <w:p>
+      <w:pPr>
+        <w:pStyle w:val="ListParagraph"/>
+        <w:numPr>
+          <w:ilvl w:val="0"/>
+          <w:numId w:val="2"/>
+        </w:numPr>
+        <w:rPr>
+          <w:b/>
+          <w:bCs/>
+          <w:sz w:val="36"/>
+          <w:szCs w:val="36"/>
+          <w:highlight w:val="yellow"/>
+          <w:u w:val="single"/>
+        </w:rPr>
+      </w:pPr>
+      <w:r>
+        <w:rPr>
+          <w:b/>
+          <w:bCs/>
+          <w:sz w:val="36"/>
+          <w:szCs w:val="36"/>
+          <w:highlight w:val="yellow"/>
+          <w:u w:val="single"/>
+        </w:rPr>
+        <w:t>Reason behind and Evil Portal Attack:</w:t>
+      </w:r>
+    </w:p>
+    <w:p>
+      <w:pPr>
+        <w:pStyle w:val="ListParagraph"/>
+        <w:numPr>
+          <w:ilvl w:val="1"/>
+          <w:numId w:val="2"/>
+        </w:numPr>
+        <w:rPr>
+          <w:b/>
+          <w:bCs/>
+          <w:sz w:val="32"/>
+          <w:szCs w:val="32"/>
+          <w:highlight w:val="cyan"/>
+        </w:rPr>
+      </w:pPr>
+      <w:r>
+        <w:rPr>
+          <w:b/>
+          <w:bCs/>
+          <w:sz w:val="32"/>
+          <w:szCs w:val="32"/>
+          <w:highlight w:val="cyan"/>
+        </w:rPr>
+        <w:t>Broadcasting:</w:t>
+      </w:r>
+    </w:p>
+    <w:p>
+      <w:pPr>
+        <w:pStyle w:val="ListParagraph"/>
+        <w:numPr>
+          <w:ilvl w:val="2"/>
+          <w:numId w:val="2"/>
+        </w:numPr>
+      </w:pPr>
+      <w:r>
+        <w:t xml:space="preserve">Your ESP32 is now acting as a rogue Access Point with the name you created. </w:t>
+      </w:r>
+    </w:p>
+    <w:p>
+      <w:pPr>
+        <w:pStyle w:val="ListParagraph"/>
+        <w:numPr>
+          <w:ilvl w:val="1"/>
+          <w:numId w:val="2"/>
+        </w:numPr>
+        <w:rPr>
+          <w:b/>
+          <w:bCs/>
+          <w:sz w:val="32"/>
+          <w:szCs w:val="32"/>
+          <w:highlight w:val="cyan"/>
+        </w:rPr>
+      </w:pPr>
+      <w:r>
+        <w:rPr>
+          <w:b/>
+          <w:bCs/>
+          <w:sz w:val="32"/>
+          <w:szCs w:val="32"/>
+          <w:highlight w:val="cyan"/>
+        </w:rPr>
+        <w:t>DNS hijacking:</w:t>
+      </w:r>
+    </w:p>
+    <w:p>
+      <w:pPr>
+        <w:pStyle w:val="ListParagraph"/>
+        <w:numPr>
+          <w:ilvl w:val="2"/>
+          <w:numId w:val="2"/>
+        </w:numPr>
+      </w:pPr>
+      <w:r>
+        <w:t xml:space="preserve">When a device connects, the ESP32 will tell the device that every website it tries to visit is actually your Flippers HTML page. </w:t>
+      </w:r>
+    </w:p>
+    <w:p>
+      <w:pPr>
+        <w:pStyle w:val="ListParagraph"/>
+        <w:numPr>
+          <w:ilvl w:val="1"/>
+          <w:numId w:val="2"/>
+        </w:numPr>
+        <w:rPr>
+          <w:b/>
+          <w:bCs/>
+          <w:sz w:val="32"/>
+          <w:szCs w:val="32"/>
+          <w:highlight w:val="cyan"/>
+        </w:rPr>
+      </w:pPr>
+      <w:r>
+        <w:rPr>
+          <w:b/>
+          <w:bCs/>
+          <w:sz w:val="32"/>
+          <w:szCs w:val="32"/>
+          <w:highlight w:val="cyan"/>
+        </w:rPr>
+        <w:t>Captive Portal Trigger:</w:t>
+      </w:r>
+    </w:p>
+    <w:p>
+      <w:pPr>
+        <w:pStyle w:val="ListParagraph"/>
+        <w:numPr>
+          <w:ilvl w:val="2"/>
+          <w:numId w:val="2"/>
+        </w:numPr>
+      </w:pPr>
+      <w:r>
+        <w:t xml:space="preserve">On most phones a notification will pop up saying “Log in to network” or a browser window will open automatically showing your portal. </w:t>
+      </w:r>
+    </w:p>
+    <w:p>
+      <w:pPr>
+        <w:pStyle w:val="ListParagraph"/>
+        <w:numPr>
+          <w:ilvl w:val="0"/>
+          <w:numId w:val="2"/>
+        </w:numPr>
+      </w:pPr>
+      <w:r>
+        <w:t xml:space="preserve">Make fake register page using CSS styles and html index &gt; upload code to VS Code &gt; plug in flipper to computer &gt; copy code into the html folder </w:t>
+      </w:r>
+    </w:p>
+    <w:p>
+      <w:pPr>
+        <w:pStyle w:val="ListParagraph"/>
+        <w:numPr>
+          <w:ilvl w:val="1"/>
+          <w:numId w:val="2"/>
+        </w:numPr>
+        <w:rPr>
+          <w:b/>
+          <w:bCs/>
+          <w:sz w:val="28"/>
+          <w:szCs w:val="28"/>
+          <w:highlight w:val="yellow"/>
+          <w:u w:val="single"/>
+        </w:rPr>
+      </w:pPr>
+      <w:r>
+        <w:rPr>
+          <w:b/>
+          <w:bCs/>
+          <w:sz w:val="28"/>
+          <w:szCs w:val="28"/>
+          <w:highlight w:val="yellow"/>
+          <w:u w:val="single"/>
+        </w:rPr>
+        <w:t>External Links:</w:t>
+      </w:r>
+    </w:p>
+    <w:p>
+      <w:pPr>
+        <w:pStyle w:val="ListParagraph"/>
+        <w:numPr>
+          <w:ilvl w:val="2"/>
+          <w:numId w:val="2"/>
+        </w:numPr>
+      </w:pPr>
+      <w:r>
+        <w:t xml:space="preserve">If your FreeCodeCamp project uses external links for CSS or images, they </w:t>
+      </w:r>
+      <w:r>
+        <w:rPr>
+          <w:b/>
+          <w:bCs/>
+        </w:rPr>
+        <w:t>will not load</w:t>
+      </w:r>
+      <w:r>
+        <w:t>.</w:t>
+      </w:r>
+    </w:p>
+    <w:p>
+      <w:pPr>
+        <w:pStyle w:val="ListParagraph"/>
+        <w:numPr>
+          <w:ilvl w:val="2"/>
+          <w:numId w:val="2"/>
+        </w:numPr>
+        <w:rPr>
+          <w:sz w:val="32"/>
+          <w:szCs w:val="32"/>
+          <w:highlight w:val="cyan"/>
+        </w:rPr>
+      </w:pPr>
+      <w:r>
+        <w:rPr>
+          <w:b/>
+          <w:bCs/>
+          <w:sz w:val="32"/>
+          <w:szCs w:val="32"/>
+          <w:highlight w:val="cyan"/>
+        </w:rPr>
+        <w:t>Wrong:</w:t>
+      </w:r>
+      <w:r>
+        <w:rPr>
+          <w:sz w:val="32"/>
+          <w:szCs w:val="32"/>
+          <w:highlight w:val="cyan"/>
+        </w:rPr>
+        <w:t xml:space="preserve"> </w:t>
+      </w:r>
+    </w:p>
+    <w:p>
+      <w:pPr>
+        <w:pStyle w:val="ListParagraph"/>
+        <w:numPr>
+          <w:ilvl w:val="3"/>
+          <w:numId w:val="2"/>
+        </w:numPr>
+      </w:pPr>
+      <w:r>
+        <w:t>&lt;link rel="stylesheet" href="style.css"&gt; or &lt;img src="https://site.com"&gt;</w:t>
+      </w:r>
+    </w:p>
+    <w:p>
+      <w:pPr>
+        <w:pStyle w:val="ListParagraph"/>
+        <w:numPr>
+          <w:ilvl w:val="2"/>
+          <w:numId w:val="2"/>
+        </w:numPr>
+        <w:rPr>
+          <w:sz w:val="32"/>
+          <w:szCs w:val="32"/>
+          <w:highlight w:val="cyan"/>
+        </w:rPr>
+      </w:pPr>
+      <w:r>
+        <w:rPr>
+          <w:b/>
+          <w:bCs/>
+          <w:sz w:val="32"/>
+          <w:szCs w:val="32"/>
+          <w:highlight w:val="cyan"/>
+        </w:rPr>
+        <w:t>Right:</w:t>
+      </w:r>
+      <w:r>
+        <w:rPr>
+          <w:sz w:val="32"/>
+          <w:szCs w:val="32"/>
+          <w:highlight w:val="cyan"/>
+        </w:rPr>
+        <w:t xml:space="preserve"> </w:t>
+      </w:r>
+    </w:p>
+    <w:p>
+      <w:pPr>
+        <w:pStyle w:val="ListParagraph"/>
+        <w:numPr>
+          <w:ilvl w:val="3"/>
+          <w:numId w:val="2"/>
+        </w:numPr>
+      </w:pPr>
+      <w:r>
+        <w:t xml:space="preserve">You must use </w:t>
+      </w:r>
+      <w:r>
+        <w:rPr>
+          <w:b/>
+          <w:bCs/>
+        </w:rPr>
+        <w:t>Internal CSS</w:t>
+      </w:r>
+      <w:r>
+        <w:t>. Put all your CSS between &lt;style&gt; and &lt;/style&gt; tags inside the &lt;head&gt; of your index.html file.</w:t>
+      </w:r>
+    </w:p>
+    <w:p>
+      <w:pPr>
+        <w:pStyle w:val="ListParagraph"/>
+        <w:numPr>
+          <w:ilvl w:val="3"/>
+          <w:numId w:val="2"/>
+        </w:numPr>
+      </w:pPr>
+      <w:r>
+        <w:rPr>
+          <w:b/>
+          <w:bCs/>
+        </w:rPr>
+        <w:t>Why?</w:t>
+      </w:r>
+      <w:r>
+        <w:t xml:space="preserve"> Remember, the victim has "No Internet." Their phone cannot reach out to the web to download your CSS file or images.</w:t>
+      </w:r>
+    </w:p>
+    <w:p>
+      <w:pPr>
+        <w:pStyle w:val="ListParagraph"/>
+        <w:numPr>
+          <w:ilvl w:val="1"/>
+          <w:numId w:val="2"/>
+        </w:numPr>
+        <w:rPr>
+          <w:b/>
+          <w:bCs/>
+          <w:sz w:val="28"/>
+          <w:szCs w:val="28"/>
+          <w:highlight w:val="yellow"/>
+          <w:u w:val="single"/>
+        </w:rPr>
+      </w:pPr>
+      <w:r>
+        <w:rPr>
+          <w:b/>
+          <w:bCs/>
+          <w:sz w:val="28"/>
+          <w:szCs w:val="28"/>
+          <w:highlight w:val="yellow"/>
+          <w:u w:val="single"/>
+        </w:rPr>
+        <w:t>File Size:</w:t>
+      </w:r>
+    </w:p>
+    <w:p>
+      <w:pPr>
+        <w:pStyle w:val="ListParagraph"/>
+        <w:numPr>
+          <w:ilvl w:val="2"/>
+          <w:numId w:val="2"/>
+        </w:numPr>
+        <w:rPr>
+          <w:b/>
+          <w:bCs/>
+          <w:sz w:val="32"/>
+          <w:szCs w:val="32"/>
+          <w:highlight w:val="cyan"/>
+        </w:rPr>
+      </w:pPr>
+      <w:r>
+        <w:rPr>
+          <w:b/>
+          <w:bCs/>
+          <w:sz w:val="32"/>
+          <w:szCs w:val="32"/>
+          <w:highlight w:val="cyan"/>
+        </w:rPr>
+        <w:lastRenderedPageBreak/>
+        <w:t xml:space="preserve">ESP32 has very limited RAM </w:t>
+      </w:r>
+    </w:p>
+    <w:p>
+      <w:pPr>
+        <w:pStyle w:val="ListParagraph"/>
+        <w:numPr>
+          <w:ilvl w:val="3"/>
+          <w:numId w:val="2"/>
+        </w:numPr>
+      </w:pPr>
+      <w:r>
+        <w:rPr>
+          <w:b/>
+          <w:bCs/>
+        </w:rPr>
+        <w:t>Limit</w:t>
+      </w:r>
+      <w:r>
+        <w:t>:</w:t>
+      </w:r>
+    </w:p>
+    <w:p>
+      <w:pPr>
+        <w:pStyle w:val="ListParagraph"/>
+        <w:numPr>
+          <w:ilvl w:val="4"/>
+          <w:numId w:val="2"/>
+        </w:numPr>
+      </w:pPr>
+      <w:r>
+        <w:t xml:space="preserve">Keep your index.html file under 10KB to 20KB </w:t>
+      </w:r>
+    </w:p>
+    <w:p>
+      <w:pPr>
+        <w:pStyle w:val="ListParagraph"/>
+        <w:numPr>
+          <w:ilvl w:val="3"/>
+          <w:numId w:val="2"/>
+        </w:numPr>
+      </w:pPr>
+      <w:r>
+        <w:rPr>
+          <w:b/>
+          <w:bCs/>
+        </w:rPr>
+        <w:t>Avoid</w:t>
+      </w:r>
+      <w:r>
+        <w:t>:</w:t>
+      </w:r>
+    </w:p>
+    <w:p>
+      <w:pPr>
+        <w:pStyle w:val="ListParagraph"/>
+        <w:numPr>
+          <w:ilvl w:val="4"/>
+          <w:numId w:val="2"/>
+        </w:numPr>
+      </w:pPr>
+      <w:r>
+        <w:t xml:space="preserve">Don’t use large high-red images. </w:t>
+      </w:r>
+    </w:p>
+    <w:p>
+      <w:pPr>
+        <w:pStyle w:val="ListParagraph"/>
+        <w:numPr>
+          <w:ilvl w:val="5"/>
+          <w:numId w:val="2"/>
+        </w:numPr>
+      </w:pPr>
+      <w:r>
+        <w:t xml:space="preserve">If you need a logo, use a </w:t>
+      </w:r>
+      <w:r>
+        <w:rPr>
+          <w:b/>
+          <w:bCs/>
+        </w:rPr>
+        <w:t>Base64 encoded string</w:t>
+      </w:r>
+      <w:r>
+        <w:t xml:space="preserve"> or a simple SVG, but keep it small.</w:t>
+      </w:r>
+    </w:p>
+    <w:p>
+      <w:pPr>
+        <w:pStyle w:val="ListParagraph"/>
+        <w:numPr>
+          <w:ilvl w:val="1"/>
+          <w:numId w:val="2"/>
+        </w:numPr>
+      </w:pPr>
+      <w:r>
+        <w:rPr>
+          <w:sz w:val="32"/>
+          <w:szCs w:val="32"/>
+          <w:highlight w:val="cyan"/>
+        </w:rPr>
+        <w:t>Code in VS Code:</w:t>
+      </w:r>
+      <w:r>
+        <w:t xml:space="preserve"> Write your HTML and CSS in one single file.</w:t>
+      </w:r>
+    </w:p>
+    <w:p>
+      <w:pPr>
+        <w:pStyle w:val="ListParagraph"/>
+        <w:numPr>
+          <w:ilvl w:val="1"/>
+          <w:numId w:val="2"/>
+        </w:numPr>
+      </w:pPr>
+      <w:r>
+        <w:rPr>
+          <w:sz w:val="32"/>
+          <w:szCs w:val="32"/>
+          <w:highlight w:val="cyan"/>
+        </w:rPr>
+        <w:t>Modify the Form:</w:t>
+      </w:r>
+      <w:r>
+        <w:t xml:space="preserve"> Ensure it is &lt;form method="POST" action="/"&gt;.</w:t>
+      </w:r>
+    </w:p>
+    <w:p>
+      <w:pPr>
+        <w:pStyle w:val="ListParagraph"/>
+        <w:numPr>
+          <w:ilvl w:val="1"/>
+          <w:numId w:val="2"/>
+        </w:numPr>
+      </w:pPr>
+      <w:r>
+        <w:rPr>
+          <w:sz w:val="28"/>
+          <w:szCs w:val="28"/>
+          <w:highlight w:val="cyan"/>
+        </w:rPr>
+        <w:t>Check Input Names:</w:t>
+      </w:r>
+      <w:r>
+        <w:t xml:space="preserve"> Make sure your text boxes have names (e.g., &lt;input name="username"&gt;). The Flipper uses these names to label the stolen data.</w:t>
+      </w:r>
+    </w:p>
+    <w:p>
+      <w:pPr>
+        <w:pStyle w:val="ListParagraph"/>
+        <w:numPr>
+          <w:ilvl w:val="1"/>
+          <w:numId w:val="2"/>
+        </w:numPr>
+      </w:pPr>
+      <w:r>
+        <w:rPr>
+          <w:sz w:val="28"/>
+          <w:szCs w:val="28"/>
+          <w:highlight w:val="cyan"/>
+        </w:rPr>
+        <w:t>Connect Flipper:</w:t>
+      </w:r>
+      <w:r>
+        <w:t xml:space="preserve"> Use </w:t>
+      </w:r>
+      <w:r>
+        <w:rPr>
+          <w:b/>
+          <w:bCs/>
+        </w:rPr>
+        <w:t>qFlipper</w:t>
+      </w:r>
+      <w:r>
+        <w:t xml:space="preserve"> on your PC.</w:t>
+      </w:r>
+    </w:p>
+    <w:p>
+      <w:pPr>
+        <w:pStyle w:val="ListParagraph"/>
+        <w:numPr>
+          <w:ilvl w:val="1"/>
+          <w:numId w:val="2"/>
+        </w:numPr>
+        <w:rPr>
+          <w:sz w:val="32"/>
+          <w:szCs w:val="32"/>
+          <w:highlight w:val="cyan"/>
+        </w:rPr>
+      </w:pPr>
+      <w:r>
+        <w:rPr>
+          <w:sz w:val="32"/>
+          <w:szCs w:val="32"/>
+          <w:highlight w:val="cyan"/>
+        </w:rPr>
+        <w:t>Upload:</w:t>
+      </w:r>
+    </w:p>
+    <w:p>
+      <w:pPr>
+        <w:pStyle w:val="ListParagraph"/>
+        <w:numPr>
+          <w:ilvl w:val="2"/>
+          <w:numId w:val="2"/>
+        </w:numPr>
+      </w:pPr>
+      <w:r>
+        <w:t xml:space="preserve">Open qFlipper -&gt; </w:t>
+      </w:r>
+      <w:r>
+        <w:rPr>
+          <w:b/>
+          <w:bCs/>
+        </w:rPr>
+        <w:t>File Manager</w:t>
+      </w:r>
+      <w:r>
+        <w:t>.</w:t>
+      </w:r>
+    </w:p>
+    <w:p>
+      <w:pPr>
+        <w:pStyle w:val="ListParagraph"/>
+        <w:numPr>
+          <w:ilvl w:val="2"/>
+          <w:numId w:val="2"/>
+        </w:numPr>
+      </w:pPr>
+      <w:r>
+        <w:t>Navigate to ext/apps_data/marauder/html/.</w:t>
+      </w:r>
+    </w:p>
+    <w:p>
+      <w:pPr>
+        <w:pStyle w:val="ListParagraph"/>
+        <w:numPr>
+          <w:ilvl w:val="2"/>
+          <w:numId w:val="2"/>
+        </w:numPr>
+      </w:pPr>
+      <w:r>
+        <w:t>Drag your index.html into that folder.</w:t>
+      </w:r>
+    </w:p>
+    <w:p>
+      <w:pPr>
+        <w:pStyle w:val="ListParagraph"/>
+        <w:numPr>
+          <w:ilvl w:val="1"/>
+          <w:numId w:val="2"/>
+        </w:numPr>
+        <w:rPr>
+          <w:sz w:val="32"/>
+          <w:szCs w:val="32"/>
+          <w:highlight w:val="cyan"/>
+        </w:rPr>
+      </w:pPr>
+      <w:r>
+        <w:rPr>
+          <w:sz w:val="32"/>
+          <w:szCs w:val="32"/>
+          <w:highlight w:val="cyan"/>
+        </w:rPr>
+        <w:t>Run on Flipper:</w:t>
+      </w:r>
+    </w:p>
+    <w:p>
+      <w:pPr>
+        <w:pStyle w:val="ListParagraph"/>
+        <w:numPr>
+          <w:ilvl w:val="2"/>
+          <w:numId w:val="2"/>
+        </w:numPr>
+      </w:pPr>
+      <w:r>
+        <w:t>Open Marauder app.</w:t>
+      </w:r>
+    </w:p>
+    <w:p>
+      <w:pPr>
+        <w:pStyle w:val="ListParagraph"/>
+        <w:numPr>
+          <w:ilvl w:val="2"/>
+          <w:numId w:val="2"/>
+        </w:numPr>
+      </w:pPr>
+      <w:r>
+        <w:rPr>
+          <w:b/>
+          <w:bCs/>
+        </w:rPr>
+        <w:t>Evil Portal</w:t>
+      </w:r>
+      <w:r>
+        <w:t xml:space="preserve"> -&gt; </w:t>
+      </w:r>
+      <w:r>
+        <w:rPr>
+          <w:b/>
+          <w:bCs/>
+        </w:rPr>
+        <w:t>Load HTML file</w:t>
+      </w:r>
+      <w:r>
+        <w:t xml:space="preserve"> -&gt; Select index.html.</w:t>
+      </w:r>
+    </w:p>
+    <w:p>
+      <w:pPr>
+        <w:pStyle w:val="ListParagraph"/>
+        <w:numPr>
+          <w:ilvl w:val="2"/>
+          <w:numId w:val="2"/>
+        </w:numPr>
+      </w:pPr>
+      <w:r>
+        <w:rPr>
+          <w:b/>
+          <w:bCs/>
+        </w:rPr>
+        <w:t>Evil Portal</w:t>
+      </w:r>
+      <w:r>
+        <w:t xml:space="preserve"> -&gt; </w:t>
+      </w:r>
+      <w:r>
+        <w:rPr>
+          <w:b/>
+          <w:bCs/>
+        </w:rPr>
+        <w:t>Start</w:t>
+      </w:r>
+      <w:r>
+        <w:t>.</w:t>
+      </w:r>
+    </w:p>
+    <w:p>
+      <w:pPr>
+        <w:pStyle w:val="ListParagraph"/>
+        <w:numPr>
+          <w:ilvl w:val="0"/>
+          <w:numId w:val="2"/>
+        </w:numPr>
+      </w:pPr>
+      <w:r>
+        <w:rPr>
+          <w:b/>
+          <w:bCs/>
+          <w:color w:val="EE0000"/>
+        </w:rPr>
+        <w:t>Note</w:t>
+      </w:r>
+      <w:r>
+        <w:t xml:space="preserve">: </w:t>
+      </w:r>
+      <w:r>
+        <w:t>Since you mentioned using CSS from FreeCodeCamp, just make sure you copy the CSS block and paste it directly into the &lt;style&gt; section of your HTML file.</w:t>
+      </w:r>
+    </w:p>
+    <w:p/>
+    <w:p/>
     <w:sectPr>
       <w:pgSz w:w="12240" w:h="15840"/>
       <w:pgMar w:top="1440" w:right="1440" w:bottom="1440" w:left="1440" w:header="720" w:footer="720" w:gutter="0"/>
@@ -445,8 +2453,100 @@
       </w:pPr>
     </w:lvl>
   </w:abstractNum>
+  <w:abstractNum w:abstractNumId="1" w15:restartNumberingAfterBreak="0">
+    <w:nsid w:val="457C5665"/>
+    <w:multiLevelType w:val="hybridMultilevel"/>
+    <w:tmpl w:val="7C22A0EC"/>
+    <w:lvl w:ilvl="0" w:tplc="04090015">
+      <w:start w:val="1"/>
+      <w:numFmt w:val="upperLetter"/>
+      <w:lvlText w:val="%1."/>
+      <w:lvlJc w:val="left"/>
+      <w:pPr>
+        <w:ind w:left="720" w:hanging="360"/>
+      </w:pPr>
+      <w:rPr>
+        <w:rFonts w:hint="default"/>
+      </w:rPr>
+    </w:lvl>
+    <w:lvl w:ilvl="1" w:tplc="04090019">
+      <w:start w:val="1"/>
+      <w:numFmt w:val="lowerLetter"/>
+      <w:lvlText w:val="%2."/>
+      <w:lvlJc w:val="left"/>
+      <w:pPr>
+        <w:ind w:left="1440" w:hanging="360"/>
+      </w:pPr>
+    </w:lvl>
+    <w:lvl w:ilvl="2" w:tplc="0409001B">
+      <w:start w:val="1"/>
+      <w:numFmt w:val="lowerRoman"/>
+      <w:lvlText w:val="%3."/>
+      <w:lvlJc w:val="right"/>
+      <w:pPr>
+        <w:ind w:left="2160" w:hanging="180"/>
+      </w:pPr>
+    </w:lvl>
+    <w:lvl w:ilvl="3" w:tplc="0409000F">
+      <w:start w:val="1"/>
+      <w:numFmt w:val="decimal"/>
+      <w:lvlText w:val="%4."/>
+      <w:lvlJc w:val="left"/>
+      <w:pPr>
+        <w:ind w:left="2880" w:hanging="360"/>
+      </w:pPr>
+    </w:lvl>
+    <w:lvl w:ilvl="4" w:tplc="04090019">
+      <w:start w:val="1"/>
+      <w:numFmt w:val="lowerLetter"/>
+      <w:lvlText w:val="%5."/>
+      <w:lvlJc w:val="left"/>
+      <w:pPr>
+        <w:ind w:left="3600" w:hanging="360"/>
+      </w:pPr>
+    </w:lvl>
+    <w:lvl w:ilvl="5" w:tplc="0409001B">
+      <w:start w:val="1"/>
+      <w:numFmt w:val="lowerRoman"/>
+      <w:lvlText w:val="%6."/>
+      <w:lvlJc w:val="right"/>
+      <w:pPr>
+        <w:ind w:left="4320" w:hanging="180"/>
+      </w:pPr>
+    </w:lvl>
+    <w:lvl w:ilvl="6" w:tplc="0409000F">
+      <w:start w:val="1"/>
+      <w:numFmt w:val="decimal"/>
+      <w:lvlText w:val="%7."/>
+      <w:lvlJc w:val="left"/>
+      <w:pPr>
+        <w:ind w:left="5040" w:hanging="360"/>
+      </w:pPr>
+    </w:lvl>
+    <w:lvl w:ilvl="7" w:tplc="04090019" w:tentative="1">
+      <w:start w:val="1"/>
+      <w:numFmt w:val="lowerLetter"/>
+      <w:lvlText w:val="%8."/>
+      <w:lvlJc w:val="left"/>
+      <w:pPr>
+        <w:ind w:left="5760" w:hanging="360"/>
+      </w:pPr>
+    </w:lvl>
+    <w:lvl w:ilvl="8" w:tplc="0409001B" w:tentative="1">
+      <w:start w:val="1"/>
+      <w:numFmt w:val="lowerRoman"/>
+      <w:lvlText w:val="%9."/>
+      <w:lvlJc w:val="right"/>
+      <w:pPr>
+        <w:ind w:left="6480" w:hanging="180"/>
+      </w:pPr>
+    </w:lvl>
+  </w:abstractNum>
   <w:num w:numId="1" w16cid:durableId="882211651">
     <w:abstractNumId w:val="0"/>
+  </w:num>
+  <w:num w:numId="2" w16cid:durableId="277102727">
+    <w:abstractNumId w:val="1"/>
   </w:num>
 </w:numbering>
 </file>
@@ -1054,6 +3154,7 @@
   <w:style w:type="character" w:default="1" w:styleId="DefaultParagraphFont">
     <w:name w:val="Default Paragraph Font"/>
     <w:uiPriority w:val="1"/>
+    <w:semiHidden/>
     <w:unhideWhenUsed/>
   </w:style>
   <w:style w:type="table" w:default="1" w:styleId="TableNormal">
@@ -1367,6 +3468,17 @@
       <w:spacing w:val="5"/>
     </w:rPr>
   </w:style>
+  <w:style w:type="character" w:styleId="Hyperlink">
+    <w:name w:val="Hyperlink"/>
+    <w:basedOn w:val="DefaultParagraphFont"/>
+    <w:uiPriority w:val="99"/>
+    <w:unhideWhenUsed/>
+    <w:rsid w:val="001E40E5"/>
+    <w:rPr>
+      <w:color w:val="0563C1" w:themeColor="hyperlink"/>
+      <w:u w:val="single"/>
+    </w:rPr>
+  </w:style>
 </w:styles>
 </file>
 

</xml_diff>